<commit_message>
update: elizabeth writing files 2026
</commit_message>
<xml_diff>
--- a/writing_workshops/NSFREU_Peer_Review.docx
+++ b/writing_workshops/NSFREU_Peer_Review.docx
@@ -34,15 +34,15 @@
         <w:spacing w:after="240"/>
         <w:rPr>
           <w:rFonts w:ascii="Calibri" w:hAnsi="Calibri" w:cs="Calibri"/>
-          <w:b/>
-          <w:bCs/>
+          <w:b w:val="1"/>
+          <w:bCs w:val="1"/>
         </w:rPr>
       </w:pPr>
       <w:r>
         <w:rPr>
           <w:rFonts w:ascii="Calibri" w:hAnsi="Calibri" w:cs="Calibri"/>
-          <w:b/>
-          <w:bCs/>
+          <w:b w:val="1"/>
+          <w:bCs w:val="1"/>
         </w:rPr>
         <w:t>Your Name:</w:t>
       </w:r>
@@ -447,11 +447,11 @@
         </w:rPr>
         <w:t>writer?</w:t>
       </w:r>
-      <w:bookmarkStart w:id="0" w:name="_GoBack"/>
+      <w:bookmarkStart w:name="_GoBack" w:id="0"/>
       <w:bookmarkEnd w:id="0"/>
     </w:p>
     <w:sectPr>
-      <w:pgSz w:w="12240" w:h="15840"/>
+      <w:pgSz w:w="12240" w:h="15840" w:orient="portrait"/>
       <w:pgMar w:top="1152" w:right="1440" w:bottom="1152" w:left="1440" w:header="720" w:footer="720" w:gutter="0"/>
       <w:cols w:space="720"/>
       <w:noEndnote/>
@@ -567,7 +567,7 @@
         <w:ind w:left="720" w:hanging="360"/>
       </w:pPr>
       <w:rPr>
-        <w:rFonts w:ascii="Arial" w:hAnsi="Arial" w:hint="default"/>
+        <w:rFonts w:hint="default" w:ascii="Arial" w:hAnsi="Arial"/>
       </w:rPr>
     </w:lvl>
     <w:lvl w:ilvl="1" w:tplc="BB8A5562">
@@ -581,7 +581,7 @@
         <w:ind w:left="1440" w:hanging="360"/>
       </w:pPr>
       <w:rPr>
-        <w:rFonts w:ascii="Arial" w:hAnsi="Arial" w:hint="default"/>
+        <w:rFonts w:hint="default" w:ascii="Arial" w:hAnsi="Arial"/>
       </w:rPr>
     </w:lvl>
     <w:lvl w:ilvl="2" w:tplc="11DA3028">
@@ -595,7 +595,7 @@
         <w:ind w:left="2160" w:hanging="360"/>
       </w:pPr>
       <w:rPr>
-        <w:rFonts w:ascii="Arial" w:hAnsi="Arial" w:hint="default"/>
+        <w:rFonts w:hint="default" w:ascii="Arial" w:hAnsi="Arial"/>
       </w:rPr>
     </w:lvl>
     <w:lvl w:ilvl="3" w:tplc="CB283940" w:tentative="1">
@@ -610,7 +610,7 @@
         <w:ind w:left="2880" w:hanging="360"/>
       </w:pPr>
       <w:rPr>
-        <w:rFonts w:ascii="Arial" w:hAnsi="Arial" w:hint="default"/>
+        <w:rFonts w:hint="default" w:ascii="Arial" w:hAnsi="Arial"/>
       </w:rPr>
     </w:lvl>
     <w:lvl w:ilvl="4" w:tplc="C8749210" w:tentative="1">
@@ -625,7 +625,7 @@
         <w:ind w:left="3600" w:hanging="360"/>
       </w:pPr>
       <w:rPr>
-        <w:rFonts w:ascii="Arial" w:hAnsi="Arial" w:hint="default"/>
+        <w:rFonts w:hint="default" w:ascii="Arial" w:hAnsi="Arial"/>
       </w:rPr>
     </w:lvl>
     <w:lvl w:ilvl="5" w:tplc="EC32FAF2" w:tentative="1">
@@ -640,7 +640,7 @@
         <w:ind w:left="4320" w:hanging="360"/>
       </w:pPr>
       <w:rPr>
-        <w:rFonts w:ascii="Arial" w:hAnsi="Arial" w:hint="default"/>
+        <w:rFonts w:hint="default" w:ascii="Arial" w:hAnsi="Arial"/>
       </w:rPr>
     </w:lvl>
     <w:lvl w:ilvl="6" w:tplc="CD9A30BC" w:tentative="1">
@@ -655,7 +655,7 @@
         <w:ind w:left="5040" w:hanging="360"/>
       </w:pPr>
       <w:rPr>
-        <w:rFonts w:ascii="Arial" w:hAnsi="Arial" w:hint="default"/>
+        <w:rFonts w:hint="default" w:ascii="Arial" w:hAnsi="Arial"/>
       </w:rPr>
     </w:lvl>
     <w:lvl w:ilvl="7" w:tplc="23D27CF0" w:tentative="1">
@@ -670,7 +670,7 @@
         <w:ind w:left="5760" w:hanging="360"/>
       </w:pPr>
       <w:rPr>
-        <w:rFonts w:ascii="Arial" w:hAnsi="Arial" w:hint="default"/>
+        <w:rFonts w:hint="default" w:ascii="Arial" w:hAnsi="Arial"/>
       </w:rPr>
     </w:lvl>
     <w:lvl w:ilvl="8" w:tplc="7D2C920E" w:tentative="1">
@@ -685,7 +685,7 @@
         <w:ind w:left="6480" w:hanging="360"/>
       </w:pPr>
       <w:rPr>
-        <w:rFonts w:ascii="Arial" w:hAnsi="Arial" w:hint="default"/>
+        <w:rFonts w:hint="default" w:ascii="Arial" w:hAnsi="Arial"/>
       </w:rPr>
     </w:lvl>
   </w:abstractNum>
@@ -797,7 +797,7 @@
   <w:docDefaults>
     <w:rPrDefault>
       <w:rPr>
-        <w:rFonts w:asciiTheme="minorHAnsi" w:eastAsiaTheme="minorEastAsia" w:hAnsiTheme="minorHAnsi" w:cstheme="minorBidi"/>
+        <w:rFonts w:asciiTheme="minorHAnsi" w:hAnsiTheme="minorHAnsi" w:eastAsiaTheme="minorEastAsia" w:cstheme="minorBidi"/>
         <w:sz w:val="24"/>
         <w:szCs w:val="24"/>
         <w:lang w:val="en-US" w:eastAsia="en-US" w:bidi="ar-SA"/>
@@ -808,14 +808,14 @@
   <w:latentStyles w:defLockedState="0" w:defUIPriority="99" w:defSemiHidden="0" w:defUnhideWhenUsed="0" w:defQFormat="0" w:count="375">
     <w:lsdException w:name="Normal" w:uiPriority="0" w:qFormat="1"/>
     <w:lsdException w:name="heading 1" w:uiPriority="9" w:qFormat="1"/>
-    <w:lsdException w:name="heading 2" w:semiHidden="1" w:uiPriority="9" w:unhideWhenUsed="1" w:qFormat="1"/>
-    <w:lsdException w:name="heading 3" w:semiHidden="1" w:uiPriority="9" w:unhideWhenUsed="1" w:qFormat="1"/>
-    <w:lsdException w:name="heading 4" w:semiHidden="1" w:uiPriority="9" w:unhideWhenUsed="1" w:qFormat="1"/>
-    <w:lsdException w:name="heading 5" w:semiHidden="1" w:uiPriority="9" w:unhideWhenUsed="1" w:qFormat="1"/>
-    <w:lsdException w:name="heading 6" w:semiHidden="1" w:uiPriority="9" w:unhideWhenUsed="1" w:qFormat="1"/>
-    <w:lsdException w:name="heading 7" w:semiHidden="1" w:uiPriority="9" w:unhideWhenUsed="1" w:qFormat="1"/>
-    <w:lsdException w:name="heading 8" w:semiHidden="1" w:uiPriority="9" w:unhideWhenUsed="1" w:qFormat="1"/>
-    <w:lsdException w:name="heading 9" w:semiHidden="1" w:uiPriority="9" w:unhideWhenUsed="1" w:qFormat="1"/>
+    <w:lsdException w:name="heading 2" w:uiPriority="9" w:semiHidden="1" w:unhideWhenUsed="1" w:qFormat="1"/>
+    <w:lsdException w:name="heading 3" w:uiPriority="9" w:semiHidden="1" w:unhideWhenUsed="1" w:qFormat="1"/>
+    <w:lsdException w:name="heading 4" w:uiPriority="9" w:semiHidden="1" w:unhideWhenUsed="1" w:qFormat="1"/>
+    <w:lsdException w:name="heading 5" w:uiPriority="9" w:semiHidden="1" w:unhideWhenUsed="1" w:qFormat="1"/>
+    <w:lsdException w:name="heading 6" w:uiPriority="9" w:semiHidden="1" w:unhideWhenUsed="1" w:qFormat="1"/>
+    <w:lsdException w:name="heading 7" w:uiPriority="9" w:semiHidden="1" w:unhideWhenUsed="1" w:qFormat="1"/>
+    <w:lsdException w:name="heading 8" w:uiPriority="9" w:semiHidden="1" w:unhideWhenUsed="1" w:qFormat="1"/>
+    <w:lsdException w:name="heading 9" w:uiPriority="9" w:semiHidden="1" w:unhideWhenUsed="1" w:qFormat="1"/>
     <w:lsdException w:name="index 1" w:semiHidden="1" w:unhideWhenUsed="1"/>
     <w:lsdException w:name="index 2" w:semiHidden="1" w:unhideWhenUsed="1"/>
     <w:lsdException w:name="index 3" w:semiHidden="1" w:unhideWhenUsed="1"/>
@@ -825,22 +825,22 @@
     <w:lsdException w:name="index 7" w:semiHidden="1" w:unhideWhenUsed="1"/>
     <w:lsdException w:name="index 8" w:semiHidden="1" w:unhideWhenUsed="1"/>
     <w:lsdException w:name="index 9" w:semiHidden="1" w:unhideWhenUsed="1"/>
-    <w:lsdException w:name="toc 1" w:semiHidden="1" w:uiPriority="39" w:unhideWhenUsed="1"/>
-    <w:lsdException w:name="toc 2" w:semiHidden="1" w:uiPriority="39" w:unhideWhenUsed="1"/>
-    <w:lsdException w:name="toc 3" w:semiHidden="1" w:uiPriority="39" w:unhideWhenUsed="1"/>
-    <w:lsdException w:name="toc 4" w:semiHidden="1" w:uiPriority="39" w:unhideWhenUsed="1"/>
-    <w:lsdException w:name="toc 5" w:semiHidden="1" w:uiPriority="39" w:unhideWhenUsed="1"/>
-    <w:lsdException w:name="toc 6" w:semiHidden="1" w:uiPriority="39" w:unhideWhenUsed="1"/>
-    <w:lsdException w:name="toc 7" w:semiHidden="1" w:uiPriority="39" w:unhideWhenUsed="1"/>
-    <w:lsdException w:name="toc 8" w:semiHidden="1" w:uiPriority="39" w:unhideWhenUsed="1"/>
-    <w:lsdException w:name="toc 9" w:semiHidden="1" w:uiPriority="39" w:unhideWhenUsed="1"/>
+    <w:lsdException w:name="toc 1" w:uiPriority="39" w:semiHidden="1" w:unhideWhenUsed="1"/>
+    <w:lsdException w:name="toc 2" w:uiPriority="39" w:semiHidden="1" w:unhideWhenUsed="1"/>
+    <w:lsdException w:name="toc 3" w:uiPriority="39" w:semiHidden="1" w:unhideWhenUsed="1"/>
+    <w:lsdException w:name="toc 4" w:uiPriority="39" w:semiHidden="1" w:unhideWhenUsed="1"/>
+    <w:lsdException w:name="toc 5" w:uiPriority="39" w:semiHidden="1" w:unhideWhenUsed="1"/>
+    <w:lsdException w:name="toc 6" w:uiPriority="39" w:semiHidden="1" w:unhideWhenUsed="1"/>
+    <w:lsdException w:name="toc 7" w:uiPriority="39" w:semiHidden="1" w:unhideWhenUsed="1"/>
+    <w:lsdException w:name="toc 8" w:uiPriority="39" w:semiHidden="1" w:unhideWhenUsed="1"/>
+    <w:lsdException w:name="toc 9" w:uiPriority="39" w:semiHidden="1" w:unhideWhenUsed="1"/>
     <w:lsdException w:name="Normal Indent" w:semiHidden="1" w:unhideWhenUsed="1"/>
     <w:lsdException w:name="footnote text" w:semiHidden="1" w:unhideWhenUsed="1"/>
     <w:lsdException w:name="annotation text" w:semiHidden="1" w:unhideWhenUsed="1"/>
     <w:lsdException w:name="header" w:semiHidden="1" w:unhideWhenUsed="1"/>
     <w:lsdException w:name="footer" w:semiHidden="1" w:unhideWhenUsed="1"/>
     <w:lsdException w:name="index heading" w:semiHidden="1" w:unhideWhenUsed="1"/>
-    <w:lsdException w:name="caption" w:semiHidden="1" w:uiPriority="35" w:unhideWhenUsed="1" w:qFormat="1"/>
+    <w:lsdException w:name="caption" w:uiPriority="35" w:semiHidden="1" w:unhideWhenUsed="1" w:qFormat="1"/>
     <w:lsdException w:name="table of figures" w:semiHidden="1" w:unhideWhenUsed="1"/>
     <w:lsdException w:name="envelope address" w:semiHidden="1" w:unhideWhenUsed="1"/>
     <w:lsdException w:name="envelope return" w:semiHidden="1" w:unhideWhenUsed="1"/>
@@ -871,7 +871,7 @@
     <w:lsdException w:name="Title" w:uiPriority="10" w:qFormat="1"/>
     <w:lsdException w:name="Closing" w:semiHidden="1" w:unhideWhenUsed="1"/>
     <w:lsdException w:name="Signature" w:semiHidden="1" w:unhideWhenUsed="1"/>
-    <w:lsdException w:name="Default Paragraph Font" w:semiHidden="1" w:uiPriority="1" w:unhideWhenUsed="1"/>
+    <w:lsdException w:name="Default Paragraph Font" w:uiPriority="1" w:semiHidden="1" w:unhideWhenUsed="1"/>
     <w:lsdException w:name="Body Text" w:semiHidden="1" w:unhideWhenUsed="1"/>
     <w:lsdException w:name="Body Text Indent" w:semiHidden="1" w:unhideWhenUsed="1"/>
     <w:lsdException w:name="List Continue" w:semiHidden="1" w:unhideWhenUsed="1"/>
@@ -1071,8 +1071,8 @@
     <w:lsdException w:name="Subtle Reference" w:uiPriority="31" w:qFormat="1"/>
     <w:lsdException w:name="Intense Reference" w:uiPriority="32" w:qFormat="1"/>
     <w:lsdException w:name="Book Title" w:uiPriority="33" w:qFormat="1"/>
-    <w:lsdException w:name="Bibliography" w:semiHidden="1" w:uiPriority="37" w:unhideWhenUsed="1"/>
-    <w:lsdException w:name="TOC Heading" w:semiHidden="1" w:uiPriority="39" w:unhideWhenUsed="1" w:qFormat="1"/>
+    <w:lsdException w:name="Bibliography" w:uiPriority="37" w:semiHidden="1" w:unhideWhenUsed="1"/>
+    <w:lsdException w:name="TOC Heading" w:uiPriority="39" w:semiHidden="1" w:unhideWhenUsed="1" w:qFormat="1"/>
     <w:lsdException w:name="Grid Table Light" w:semiHidden="1" w:unhideWhenUsed="1"/>
     <w:lsdException w:name="Grid Table 1 Light" w:semiHidden="1" w:unhideWhenUsed="1"/>
     <w:lsdException w:name="Grid Table 2" w:semiHidden="1" w:unhideWhenUsed="1"/>
@@ -1177,18 +1177,18 @@
     <w:lsdException w:name="Hashtag" w:semiHidden="1" w:unhideWhenUsed="1"/>
     <w:lsdException w:name="Unresolved Mention" w:semiHidden="1" w:unhideWhenUsed="1"/>
   </w:latentStyles>
-  <w:style w:type="paragraph" w:default="1" w:styleId="Normal">
+  <w:style w:type="paragraph" w:styleId="Normal" w:default="1">
     <w:name w:val="Normal"/>
     <w:qFormat/>
     <w:rsid w:val="00531B04"/>
   </w:style>
-  <w:style w:type="character" w:default="1" w:styleId="DefaultParagraphFont">
+  <w:style w:type="character" w:styleId="DefaultParagraphFont" w:default="1">
     <w:name w:val="Default Paragraph Font"/>
     <w:uiPriority w:val="1"/>
     <w:semiHidden/>
     <w:unhideWhenUsed/>
   </w:style>
-  <w:style w:type="table" w:default="1" w:styleId="TableNormal">
+  <w:style w:type="table" w:styleId="TableNormal" w:default="1">
     <w:name w:val="Normal Table"/>
     <w:uiPriority w:val="99"/>
     <w:semiHidden/>
@@ -1203,7 +1203,7 @@
       </w:tblCellMar>
     </w:tblPr>
   </w:style>
-  <w:style w:type="numbering" w:default="1" w:styleId="NoList">
+  <w:style w:type="numbering" w:styleId="NoList" w:default="1">
     <w:name w:val="No List"/>
     <w:uiPriority w:val="99"/>
     <w:semiHidden/>

</xml_diff>